<commit_message>
Link the verified submission branch in the final report
</commit_message>
<xml_diff>
--- a/submission/Part_2_Report.docx
+++ b/submission/Part_2_Report.docx
@@ -212,7 +212,16 @@
           <w:sz w:val="22"/>
           <w:szCs w:val="22"/>
         </w:rPr>
-        <w:t>GitHub submission URL: https://github.com/ibrahimwarraich101/is-webSecurity. Local Git development commits accompany the project. This report covers Part 2 only; Parts 1 and 3 can be added to the final combined Word submission.</w:t>
+        <w:t xml:space="preserve">GitHub submission URL: https://github.com/ibrahimwarraich101/is-webSecurity/tree/complete-question2. </w:t>
+      </w:r>
+      <w:r>
+        <w:rPr>
+          <w:rFonts w:ascii="Calibri" w:hAnsi="Calibri" w:cs="Calibri"/>
+          <w:kern w:val="0"/>
+          <w:sz w:val="22"/>
+          <w:szCs w:val="22"/>
+        </w:rPr>
+        <w:t>The complete-question2 branch contains the updated source and evidence with genuine development commits. Review: https://github.com/ibrahimwarraich101/is-webSecurity/pull/1. This report covers Part 2; Parts 1 and 3 belong in the combined Word submission.</w:t>
       </w:r>
     </w:p>
     <w:p>
@@ -346,7 +355,16 @@
           <w:sz w:val="22"/>
           <w:szCs w:val="22"/>
         </w:rPr>
-        <w:t>Start the attacker in another terminal: python app.py --attacker. It listens at http://127.0.0.1:8001. Main and attacker servers bind only to loopback. All accounts and extracted credentials are synthetic lab records.</w:t>
+        <w:t>Start the attacker in another terminal: python app.py --attacker. Open</w:t>
+      </w:r>
+      <w:r>
+        <w:rPr>
+          <w:rFonts w:ascii="Calibri" w:hAnsi="Calibri" w:cs="Calibri"/>
+          <w:kern w:val="0"/>
+          <w:sz w:val="22"/>
+          <w:szCs w:val="22"/>
+        </w:rPr>
+        <w:t xml:space="preserve"> http://localhost:8001/vulnerable or http://localhost:8001/safe. Main and attacker servers bind only to loopback. All accounts and extracted credentials are synthetic lab records.</w:t>
       </w:r>
     </w:p>
     <w:p>
@@ -394,31 +412,49 @@
           <w:sz w:val="22"/>
           <w:szCs w:val="22"/>
         </w:rPr>
-        <w:t>Tables: users(id, username, password, email, role); courses(code, title, credits); comments(id, author, body); enrollments(id, reference, user_id, course_code). The populated seed-data.sql creates both databases; safe initialization hashes its passwords before serving requests.</w:t>
-      </w:r>
-    </w:p>
-    <w:p>
-      <w:pPr>
-        <w:widowControl w:val="0"/>
-        <w:autoSpaceDE w:val="0"/>
-        <w:autoSpaceDN w:val="0"/>
-        <w:adjustRightInd w:val="0"/>
-        <w:spacing w:after="180" w:line="280" w:lineRule="auto"/>
-        <w:rPr>
-          <w:rFonts w:ascii="Calibri" w:hAnsi="Calibri" w:cs="Calibri"/>
-          <w:kern w:val="0"/>
-          <w:sz w:val="22"/>
-          <w:szCs w:val="22"/>
-        </w:rPr>
-      </w:pPr>
-      <w:r>
-        <w:rPr>
-          <w:rFonts w:ascii="Calibri" w:hAnsi="Calibri" w:cs="Calibri"/>
-          <w:kern w:val="0"/>
-          <w:sz w:val="22"/>
-          <w:szCs w:val="22"/>
-        </w:rPr>
-        <w:t>Re-run live HTTP tests: python tests/test_security.py. Browser evidence: install the development-only Playwright package, then node tests/browser_evidence.cjs. tests/build_report.py builds the report from the original PNG images. tests/export_word.ps1 converts its temporary RTF to native DOCX through Microsoft Word. The submitted DOCX is editable and can be merged into the final combined report.</w:t>
+        <w:t>Tables: users(id, username, password, email</w:t>
+      </w:r>
+      <w:r>
+        <w:rPr>
+          <w:rFonts w:ascii="Calibri" w:hAnsi="Calibri" w:cs="Calibri"/>
+          <w:kern w:val="0"/>
+          <w:sz w:val="22"/>
+          <w:szCs w:val="22"/>
+        </w:rPr>
+        <w:t>, role); courses(code, title, credits); comments(id, author, body); enrollments(id, reference, user_id, course_code). The populated seed-data.sql creates both databases; safe initialization hashes its passwords before serving requests.</w:t>
+      </w:r>
+    </w:p>
+    <w:p>
+      <w:pPr>
+        <w:widowControl w:val="0"/>
+        <w:autoSpaceDE w:val="0"/>
+        <w:autoSpaceDN w:val="0"/>
+        <w:adjustRightInd w:val="0"/>
+        <w:spacing w:after="180" w:line="280" w:lineRule="auto"/>
+        <w:rPr>
+          <w:rFonts w:ascii="Calibri" w:hAnsi="Calibri" w:cs="Calibri"/>
+          <w:kern w:val="0"/>
+          <w:sz w:val="22"/>
+          <w:szCs w:val="22"/>
+        </w:rPr>
+      </w:pPr>
+      <w:r>
+        <w:rPr>
+          <w:rFonts w:ascii="Calibri" w:hAnsi="Calibri" w:cs="Calibri"/>
+          <w:kern w:val="0"/>
+          <w:sz w:val="22"/>
+          <w:szCs w:val="22"/>
+        </w:rPr>
+        <w:t>Re-run live HTTP tests: python tests/test_security.py. Browser evidence: install the development-only Playwright package, then node tests/browser_evidence.cjs. tests/build_report.py builds the report from the original PNG images. tests/export_wor</w:t>
+      </w:r>
+      <w:r>
+        <w:rPr>
+          <w:rFonts w:ascii="Calibri" w:hAnsi="Calibri" w:cs="Calibri"/>
+          <w:kern w:val="0"/>
+          <w:sz w:val="22"/>
+          <w:szCs w:val="22"/>
+        </w:rPr>
+        <w:t>d.ps1 converts its temporary RTF to native DOCX through Microsoft Word. The submitted DOCX is editable and can be merged into the final combined report.</w:t>
       </w:r>
     </w:p>
     <w:p>
@@ -552,7 +588,16 @@
           <w:sz w:val="22"/>
           <w:szCs w:val="22"/>
         </w:rPr>
-        <w:t>Stored XSS: discussion input is stored in SQLite with a parameterized INSERT, but the vulnerable output emits its body as raw HTML. A separate guest visitor loads that saved input and executes it. Safe mode encodes the body at output, preserving the original text without executing it.</w:t>
+        <w:t>Stored XSS: discussion input is stored in SQLite with a parameterized INSERT, but the vulnerable output emits its body as raw HTML. A separate guest visitor loads that saved input and executes it. Safe mode encodes the body at output, preser</w:t>
+      </w:r>
+      <w:r>
+        <w:rPr>
+          <w:rFonts w:ascii="Calibri" w:hAnsi="Calibri" w:cs="Calibri"/>
+          <w:kern w:val="0"/>
+          <w:sz w:val="22"/>
+          <w:szCs w:val="22"/>
+        </w:rPr>
+        <w:t>ving the original text without executing it.</w:t>
       </w:r>
     </w:p>
     <w:p>
@@ -600,7 +645,16 @@
           <w:sz w:val="22"/>
           <w:szCs w:val="22"/>
         </w:rPr>
-        <w:t>CSRF: the vulnerable email update trusts the session cookie without verifying a token or Origin. The external page submits an automatic POST without consent. Safe mode uses a random session-bound token, constant-time comparison, exact Origin validation and explicit SameSite=Lax cookies. The two screenshots after each attack verify the database-backed profile state.</w:t>
+        <w:t xml:space="preserve">CSRF: the vulnerable email update trusts the session cookie without verifying a token or Origin. The external page submits an automatic POST without consent. Safe mode uses a random </w:t>
+      </w:r>
+      <w:r>
+        <w:rPr>
+          <w:rFonts w:ascii="Calibri" w:hAnsi="Calibri" w:cs="Calibri"/>
+          <w:kern w:val="0"/>
+          <w:sz w:val="22"/>
+          <w:szCs w:val="22"/>
+        </w:rPr>
+        <w:t>session-bound token, constant-time comparison, exact Origin validation and explicit SameSite=Lax cookies. The two screenshots after each attack verify the database-backed profile state.</w:t>
       </w:r>
     </w:p>
     <w:p>
@@ -648,40 +702,49 @@
           <w:sz w:val="22"/>
           <w:szCs w:val="22"/>
         </w:rPr>
-        <w:t>Intermediate SQL injection: the enrollment lookup exposes only found or not found. Appending true and false predicates confirms injection; testing the first characte</w:t>
-      </w:r>
-      <w:r>
-        <w:rPr>
-          <w:rFonts w:ascii="Calibri" w:hAnsi="Calibri" w:cs="Calibri"/>
-          <w:kern w:val="0"/>
-          <w:sz w:val="22"/>
-          <w:szCs w:val="22"/>
-        </w:rPr>
-        <w:t>r of the admin password reveals A without printing the password. Safe mode binds the reference as data.</w:t>
-      </w:r>
-    </w:p>
-    <w:p>
-      <w:pPr>
-        <w:widowControl w:val="0"/>
-        <w:autoSpaceDE w:val="0"/>
-        <w:autoSpaceDN w:val="0"/>
-        <w:adjustRightInd w:val="0"/>
-        <w:spacing w:after="180" w:line="280" w:lineRule="auto"/>
-        <w:rPr>
-          <w:rFonts w:ascii="Calibri" w:hAnsi="Calibri" w:cs="Calibri"/>
-          <w:kern w:val="0"/>
-          <w:sz w:val="22"/>
-          <w:szCs w:val="22"/>
-        </w:rPr>
-      </w:pPr>
-      <w:r>
-        <w:rPr>
-          <w:rFonts w:ascii="Calibri" w:hAnsi="Calibri" w:cs="Calibri"/>
-          <w:kern w:val="0"/>
-          <w:sz w:val="22"/>
-          <w:szCs w:val="22"/>
-        </w:rPr>
-        <w:t>Advanced SQL injection: ORDER BY 3 succeeds and ORDER BY 4 fails, establishing three result columns. UNION queries enumerate the database, tables and users columns before extracting demo credentials. SQLite schema introspection through pragma_database_list, sqlite_master and pragma_table_info is the equivalent of information_schema. Safe mode parameterizes the LIKE value.</w:t>
+        <w:t>Inter</w:t>
+      </w:r>
+      <w:r>
+        <w:rPr>
+          <w:rFonts w:ascii="Calibri" w:hAnsi="Calibri" w:cs="Calibri"/>
+          <w:kern w:val="0"/>
+          <w:sz w:val="22"/>
+          <w:szCs w:val="22"/>
+        </w:rPr>
+        <w:t>mediate SQL injection: the enrollment lookup exposes only found or not found. Appending true and false predicates confirms injection; testing the first character of the admin password reveals A without printing the password. Safe mode binds the reference as data.</w:t>
+      </w:r>
+    </w:p>
+    <w:p>
+      <w:pPr>
+        <w:widowControl w:val="0"/>
+        <w:autoSpaceDE w:val="0"/>
+        <w:autoSpaceDN w:val="0"/>
+        <w:adjustRightInd w:val="0"/>
+        <w:spacing w:after="180" w:line="280" w:lineRule="auto"/>
+        <w:rPr>
+          <w:rFonts w:ascii="Calibri" w:hAnsi="Calibri" w:cs="Calibri"/>
+          <w:kern w:val="0"/>
+          <w:sz w:val="22"/>
+          <w:szCs w:val="22"/>
+        </w:rPr>
+      </w:pPr>
+      <w:r>
+        <w:rPr>
+          <w:rFonts w:ascii="Calibri" w:hAnsi="Calibri" w:cs="Calibri"/>
+          <w:kern w:val="0"/>
+          <w:sz w:val="22"/>
+          <w:szCs w:val="22"/>
+        </w:rPr>
+        <w:t>Advanced SQL injection: ORDER BY 3 succeeds and ORDER BY 4 fails, establishing three result columns. UNION queries enumerate the database, tables and users columns before extracting demo credentials. SQLite schema intr</w:t>
+      </w:r>
+      <w:r>
+        <w:rPr>
+          <w:rFonts w:ascii="Calibri" w:hAnsi="Calibri" w:cs="Calibri"/>
+          <w:kern w:val="0"/>
+          <w:sz w:val="22"/>
+          <w:szCs w:val="22"/>
+        </w:rPr>
+        <w:t>ospection through pragma_database_list, sqlite_master and pragma_table_info is the equivalent of information_schema. Safe mode parameterizes the LIKE value.</w:t>
       </w:r>
     </w:p>
     <w:p>
@@ -767,31 +830,49 @@
           <w:sz w:val="22"/>
           <w:szCs w:val="22"/>
         </w:rPr>
-        <w:t>The attacker is http://localhost:8001 and the target is http://localhost:8000. These are different origins on the same site. The attacker page submits a forged email update using the existing browser session, without a token. This genuine CSRF demonstration does not depend on the age of the session cookie. Visit /vulnerable for automatic submission, or /vulnerable?manual=1 to inspect the form before pressing Continue.</w:t>
-      </w:r>
-    </w:p>
-    <w:p>
-      <w:pPr>
-        <w:widowControl w:val="0"/>
-        <w:autoSpaceDE w:val="0"/>
-        <w:autoSpaceDN w:val="0"/>
-        <w:adjustRightInd w:val="0"/>
-        <w:spacing w:after="180" w:line="280" w:lineRule="auto"/>
-        <w:rPr>
-          <w:rFonts w:ascii="Calibri" w:hAnsi="Calibri" w:cs="Calibri"/>
-          <w:kern w:val="0"/>
-          <w:sz w:val="22"/>
-          <w:szCs w:val="22"/>
-        </w:rPr>
-      </w:pPr>
-      <w:r>
-        <w:rPr>
-          <w:rFonts w:ascii="Calibri" w:hAnsi="Calibri" w:cs="Calibri"/>
-          <w:kern w:val="0"/>
-          <w:sz w:val="22"/>
-          <w:szCs w:val="22"/>
-        </w:rPr>
-        <w:t>SameSite=Lax does not stop a same-site, cross-origin request. The safe demonstration therefore sends the real authenticated session cookie and receives HTTP 403 from server-side token and Origin validation. The unchanged profile is checked after the attack. The additional cross-site URL http://127.0.0.1:8001 remains available, but its vulnerable success can depend on browser cookie policy; use localhost:8001 for the viva.</w:t>
+        <w:t>The attacker is http://localhost:8001 and the target is http://localhost:8000. These are different origins on the same site. The attacker page submits a forged email update using the existing browser session, wi</w:t>
+      </w:r>
+      <w:r>
+        <w:rPr>
+          <w:rFonts w:ascii="Calibri" w:hAnsi="Calibri" w:cs="Calibri"/>
+          <w:kern w:val="0"/>
+          <w:sz w:val="22"/>
+          <w:szCs w:val="22"/>
+        </w:rPr>
+        <w:t>thout a token. This genuine CSRF demonstration does not depend on the age of the session cookie. Visit /vulnerable for automatic submission, or /vulnerable?manual=1 to inspect the form before pressing Continue.</w:t>
+      </w:r>
+    </w:p>
+    <w:p>
+      <w:pPr>
+        <w:widowControl w:val="0"/>
+        <w:autoSpaceDE w:val="0"/>
+        <w:autoSpaceDN w:val="0"/>
+        <w:adjustRightInd w:val="0"/>
+        <w:spacing w:after="180" w:line="280" w:lineRule="auto"/>
+        <w:rPr>
+          <w:rFonts w:ascii="Calibri" w:hAnsi="Calibri" w:cs="Calibri"/>
+          <w:kern w:val="0"/>
+          <w:sz w:val="22"/>
+          <w:szCs w:val="22"/>
+        </w:rPr>
+      </w:pPr>
+      <w:r>
+        <w:rPr>
+          <w:rFonts w:ascii="Calibri" w:hAnsi="Calibri" w:cs="Calibri"/>
+          <w:kern w:val="0"/>
+          <w:sz w:val="22"/>
+          <w:szCs w:val="22"/>
+        </w:rPr>
+        <w:t>SameSite=Lax does not stop a same-site, cross-origin request. The safe demonstration therefore sends the real authenticated session cookie and receives HTTP 403 from server-side token and Origin validation. The unchanged profile is checked after the attack. The additiona</w:t>
+      </w:r>
+      <w:r>
+        <w:rPr>
+          <w:rFonts w:ascii="Calibri" w:hAnsi="Calibri" w:cs="Calibri"/>
+          <w:kern w:val="0"/>
+          <w:sz w:val="22"/>
+          <w:szCs w:val="22"/>
+        </w:rPr>
+        <w:t>l cross-site URL http://127.0.0.1:8001 remains available, but its vulnerable success can depend on browser cookie policy; use localhost:8001 for the viva.</w:t>
       </w:r>
     </w:p>
     <w:p>
@@ -839,16 +920,7 @@
           <w:sz w:val="22"/>
           <w:szCs w:val="22"/>
         </w:rPr>
-        <w:t>For SQL injection, explain how quotes, comments and UNION alter the query structure. Demonstrate true/false inference, then follow the adva</w:t>
-      </w:r>
-      <w:r>
-        <w:rPr>
-          <w:rFonts w:ascii="Calibri" w:hAnsi="Calibri" w:cs="Calibri"/>
-          <w:kern w:val="0"/>
-          <w:sz w:val="22"/>
-          <w:szCs w:val="22"/>
-        </w:rPr>
-        <w:t>nced chain in order. The final cards contain actual synthetic records queried from SQLite, rather than a scripted success message.</w:t>
+        <w:t>For SQL injection, explain how quotes, comments and UNION alter the query structure. Demonstrate true/false inference, then follow the advanced chain in order. The final cards contain actual synthetic records queried from SQLite, rather than a scripted success message.</w:t>
       </w:r>
     </w:p>
     <w:p>
@@ -896,16 +968,7 @@
           <w:sz w:val="22"/>
           <w:szCs w:val="22"/>
         </w:rPr>
-        <w:t>The safe version addresses the assignment attack set. Production use would additionally</w:t>
-      </w:r>
-      <w:r>
-        <w:rPr>
-          <w:rFonts w:ascii="Calibri" w:hAnsi="Calibri" w:cs="Calibri"/>
-          <w:kern w:val="0"/>
-          <w:sz w:val="22"/>
-          <w:szCs w:val="22"/>
-        </w:rPr>
-        <w:t xml:space="preserve"> require HTTPS and Secure cookies, session expiry, rate limiting, access-control policy and operational monitoring.</w:t>
+        <w:t>The safe version addresses the assignment attack set. Production use would additionally require HTTPS and Secure cookies, session expiry, rate limiting, access-control policy and operational monitoring.</w:t>
       </w:r>
     </w:p>
     <w:p>
@@ -1015,16 +1078,7 @@
           <w:sz w:val="22"/>
           <w:szCs w:val="22"/>
         </w:rPr>
-        <w:t>Run python app.py --attacker,</w:t>
-      </w:r>
-      <w:r>
-        <w:rPr>
-          <w:rFonts w:ascii="Calibri" w:hAnsi="Calibri" w:cs="Calibri"/>
-          <w:kern w:val="0"/>
-          <w:sz w:val="22"/>
-          <w:szCs w:val="22"/>
-        </w:rPr>
-        <w:t xml:space="preserve"> sign in as student at http://localhost:8000/vulnerable/login, then visit http://localhost:8001/vulnerable. The external document contains this complete attack payload:</w:t>
+        <w:t>Run python app.py --attacker, sign in as student at http://localhost:8000/vulnerable/login, then visit http://localhost:8001/vulnerable. The external document contains this complete attack payload:</w:t>
       </w:r>
     </w:p>
     <w:p>
@@ -1325,7 +1379,7 @@
           <w:sz w:val="22"/>
           <w:szCs w:val="22"/>
         </w:rPr>
-        <w:pict w14:anchorId="08FC9955">
+        <w:pict w14:anchorId="48FFCB5B">
           <v:shapetype id="_x0000_t75" coordsize="21600,21600" o:spt="75" o:preferrelative="t" path="m@4@5l@4@11@9@11@9@5xe" filled="f" stroked="f">
             <v:stroke joinstyle="miter"/>
             <v:formulas>
@@ -1409,7 +1463,6 @@
           <w:sz w:val="32"/>
           <w:szCs w:val="32"/>
         </w:rPr>
-        <w:lastRenderedPageBreak/>
         <w:t>Vulnerable Version XSS Reflected</w:t>
       </w:r>
     </w:p>
@@ -1531,7 +1584,7 @@
           <w:sz w:val="22"/>
           <w:szCs w:val="22"/>
         </w:rPr>
-        <w:pict w14:anchorId="5D9311F1">
+        <w:pict w14:anchorId="18293502">
           <v:shape id="_x0000_i1026" type="#_x0000_t75" style="width:495pt;height:344.25pt">
             <v:imagedata r:id="rId5" o:title=""/>
           </v:shape>
@@ -1596,7 +1649,6 @@
           <w:sz w:val="32"/>
           <w:szCs w:val="32"/>
         </w:rPr>
-        <w:lastRenderedPageBreak/>
         <w:t>Vulnerable Version XSS DOM Based</w:t>
       </w:r>
     </w:p>
@@ -1718,7 +1770,7 @@
           <w:sz w:val="22"/>
           <w:szCs w:val="22"/>
         </w:rPr>
-        <w:pict w14:anchorId="6E243000">
+        <w:pict w14:anchorId="7FE3441F">
           <v:shape id="_x0000_i1027" type="#_x0000_t75" style="width:495pt;height:344.25pt">
             <v:imagedata r:id="rId6" o:title=""/>
           </v:shape>
@@ -1783,7 +1835,6 @@
           <w:sz w:val="32"/>
           <w:szCs w:val="32"/>
         </w:rPr>
-        <w:lastRenderedPageBreak/>
         <w:t>Vulnerable Version XSS Stored</w:t>
       </w:r>
     </w:p>
@@ -1905,7 +1956,7 @@
           <w:sz w:val="22"/>
           <w:szCs w:val="22"/>
         </w:rPr>
-        <w:pict w14:anchorId="7D526DF3">
+        <w:pict w14:anchorId="4CB95485">
           <v:shape id="_x0000_i1028" type="#_x0000_t75" style="width:495pt;height:390pt">
             <v:imagedata r:id="rId7" o:title=""/>
           </v:shape>
@@ -1970,7 +2021,6 @@
           <w:sz w:val="32"/>
           <w:szCs w:val="32"/>
         </w:rPr>
-        <w:lastRenderedPageBreak/>
         <w:t>Vulnerable Version Csrf Before</w:t>
       </w:r>
     </w:p>
@@ -2092,7 +2142,7 @@
           <w:sz w:val="22"/>
           <w:szCs w:val="22"/>
         </w:rPr>
-        <w:pict w14:anchorId="5E511084">
+        <w:pict w14:anchorId="7CEC4482">
           <v:shape id="_x0000_i1029" type="#_x0000_t75" style="width:495pt;height:344.25pt">
             <v:imagedata r:id="rId8" o:title=""/>
           </v:shape>
@@ -2157,7 +2207,6 @@
           <w:sz w:val="32"/>
           <w:szCs w:val="32"/>
         </w:rPr>
-        <w:lastRenderedPageBreak/>
         <w:t>Vulnerable Version Csrf Setup</w:t>
       </w:r>
     </w:p>
@@ -2279,7 +2328,7 @@
           <w:sz w:val="22"/>
           <w:szCs w:val="22"/>
         </w:rPr>
-        <w:pict w14:anchorId="66F380ED">
+        <w:pict w14:anchorId="0F0D3966">
           <v:shape id="_x0000_i1030" type="#_x0000_t75" style="width:495pt;height:344.25pt">
             <v:imagedata r:id="rId9" o:title=""/>
           </v:shape>
@@ -2344,7 +2393,6 @@
           <w:sz w:val="32"/>
           <w:szCs w:val="32"/>
         </w:rPr>
-        <w:lastRenderedPageBreak/>
         <w:t>Vulnerable Version Csrf Response</w:t>
       </w:r>
     </w:p>
@@ -2466,7 +2514,7 @@
           <w:sz w:val="22"/>
           <w:szCs w:val="22"/>
         </w:rPr>
-        <w:pict w14:anchorId="26A5F04C">
+        <w:pict w14:anchorId="095FAF70">
           <v:shape id="_x0000_i1031" type="#_x0000_t75" style="width:495pt;height:344.25pt">
             <v:imagedata r:id="rId10" o:title=""/>
           </v:shape>
@@ -2531,8 +2579,18 @@
           <w:sz w:val="32"/>
           <w:szCs w:val="32"/>
         </w:rPr>
-        <w:lastRenderedPageBreak/>
-        <w:t>Vulnerable Version Csrf After</w:t>
+        <w:t>Vulnerable V</w:t>
+      </w:r>
+      <w:r>
+        <w:rPr>
+          <w:rFonts w:ascii="Calibri" w:hAnsi="Calibri" w:cs="Calibri"/>
+          <w:b/>
+          <w:bCs/>
+          <w:kern w:val="0"/>
+          <w:sz w:val="32"/>
+          <w:szCs w:val="32"/>
+        </w:rPr>
+        <w:t>ersion Csrf After</w:t>
       </w:r>
     </w:p>
     <w:p>
@@ -2653,7 +2711,7 @@
           <w:sz w:val="22"/>
           <w:szCs w:val="22"/>
         </w:rPr>
-        <w:pict w14:anchorId="4700522D">
+        <w:pict w14:anchorId="36DA03B3">
           <v:shape id="_x0000_i1032" type="#_x0000_t75" style="width:495pt;height:344.25pt">
             <v:imagedata r:id="rId11" o:title=""/>
           </v:shape>
@@ -2839,7 +2897,7 @@
           <w:sz w:val="22"/>
           <w:szCs w:val="22"/>
         </w:rPr>
-        <w:pict w14:anchorId="725D5585">
+        <w:pict w14:anchorId="64CCC3B7">
           <v:shape id="_x0000_i1033" type="#_x0000_t75" style="width:495pt;height:344.25pt">
             <v:imagedata r:id="rId12" o:title=""/>
           </v:shape>
@@ -3025,7 +3083,7 @@
           <w:sz w:val="22"/>
           <w:szCs w:val="22"/>
         </w:rPr>
-        <w:pict w14:anchorId="01A6D2F8">
+        <w:pict w14:anchorId="1E7D2D95">
           <v:shape id="_x0000_i1034" type="#_x0000_t75" style="width:495pt;height:344.25pt">
             <v:imagedata r:id="rId13" o:title=""/>
           </v:shape>
@@ -3211,7 +3269,7 @@
           <w:sz w:val="22"/>
           <w:szCs w:val="22"/>
         </w:rPr>
-        <w:pict w14:anchorId="77F82D1C">
+        <w:pict w14:anchorId="434A6866">
           <v:shape id="_x0000_i1035" type="#_x0000_t75" style="width:495pt;height:344.25pt">
             <v:imagedata r:id="rId14" o:title=""/>
           </v:shape>
@@ -3397,7 +3455,7 @@
           <w:sz w:val="22"/>
           <w:szCs w:val="22"/>
         </w:rPr>
-        <w:pict w14:anchorId="06E79425">
+        <w:pict w14:anchorId="1893DE89">
           <v:shape id="_x0000_i1036" type="#_x0000_t75" style="width:495pt;height:344.25pt">
             <v:imagedata r:id="rId15" o:title=""/>
           </v:shape>
@@ -3534,7 +3592,16 @@
           <w:sz w:val="22"/>
           <w:szCs w:val="22"/>
         </w:rPr>
-        <w:t>Capture timestamp UTC: 2026-10-11T16:08:04.984Z. The screenshot footer displays PKT.</w:t>
+        <w:t>Capture timesta</w:t>
+      </w:r>
+      <w:r>
+        <w:rPr>
+          <w:rFonts w:ascii="Calibri" w:hAnsi="Calibri" w:cs="Calibri"/>
+          <w:kern w:val="0"/>
+          <w:sz w:val="22"/>
+          <w:szCs w:val="22"/>
+        </w:rPr>
+        <w:t>mp UTC: 2026-10-11T16:08:04.984Z. The screenshot footer displays PKT.</w:t>
       </w:r>
     </w:p>
     <w:p>
@@ -3583,7 +3650,7 @@
           <w:sz w:val="22"/>
           <w:szCs w:val="22"/>
         </w:rPr>
-        <w:pict w14:anchorId="7D2B0FF4">
+        <w:pict w14:anchorId="7BCCDA33">
           <v:shape id="_x0000_i1037" type="#_x0000_t75" style="width:495pt;height:344.25pt">
             <v:imagedata r:id="rId16" o:title=""/>
           </v:shape>
@@ -3769,7 +3836,7 @@
           <w:sz w:val="22"/>
           <w:szCs w:val="22"/>
         </w:rPr>
-        <w:pict w14:anchorId="780FEC8A">
+        <w:pict w14:anchorId="7CDBCBB6">
           <v:shape id="_x0000_i1038" type="#_x0000_t75" style="width:495pt;height:344.25pt">
             <v:imagedata r:id="rId17" o:title=""/>
           </v:shape>
@@ -3955,7 +4022,7 @@
           <w:sz w:val="22"/>
           <w:szCs w:val="22"/>
         </w:rPr>
-        <w:pict w14:anchorId="15F24F5D">
+        <w:pict w14:anchorId="1723089F">
           <v:shape id="_x0000_i1039" type="#_x0000_t75" style="width:495pt;height:344.25pt">
             <v:imagedata r:id="rId18" o:title=""/>
           </v:shape>
@@ -4141,7 +4208,7 @@
           <w:sz w:val="22"/>
           <w:szCs w:val="22"/>
         </w:rPr>
-        <w:pict w14:anchorId="0BDB658D">
+        <w:pict w14:anchorId="360E66D9">
           <v:shape id="_x0000_i1040" type="#_x0000_t75" style="width:495pt;height:361.5pt">
             <v:imagedata r:id="rId19" o:title=""/>
           </v:shape>
@@ -4327,7 +4394,7 @@
           <w:sz w:val="22"/>
           <w:szCs w:val="22"/>
         </w:rPr>
-        <w:pict w14:anchorId="7AD37FA0">
+        <w:pict w14:anchorId="618C5751">
           <v:shape id="_x0000_i1041" type="#_x0000_t75" style="width:427.5pt;height:395.25pt">
             <v:imagedata r:id="rId20" o:title=""/>
           </v:shape>
@@ -4464,7 +4531,16 @@
           <w:sz w:val="22"/>
           <w:szCs w:val="22"/>
         </w:rPr>
-        <w:t>Capture timestamp UTC: 2026-10-11T16:08:08.182Z. The screenshot footer displays PKT.</w:t>
+        <w:t>Capture ti</w:t>
+      </w:r>
+      <w:r>
+        <w:rPr>
+          <w:rFonts w:ascii="Calibri" w:hAnsi="Calibri" w:cs="Calibri"/>
+          <w:kern w:val="0"/>
+          <w:sz w:val="22"/>
+          <w:szCs w:val="22"/>
+        </w:rPr>
+        <w:t>mestamp UTC: 2026-10-11T16:08:08.182Z. The screenshot footer displays PKT.</w:t>
       </w:r>
     </w:p>
     <w:p>
@@ -4513,7 +4589,7 @@
           <w:sz w:val="22"/>
           <w:szCs w:val="22"/>
         </w:rPr>
-        <w:pict w14:anchorId="1ED4202D">
+        <w:pict w14:anchorId="5FFE9903">
           <v:shape id="_x0000_i1042" type="#_x0000_t75" style="width:388.5pt;height:395.25pt">
             <v:imagedata r:id="rId21" o:title=""/>
           </v:shape>
@@ -4699,7 +4775,7 @@
           <w:sz w:val="22"/>
           <w:szCs w:val="22"/>
         </w:rPr>
-        <w:pict w14:anchorId="4AE32C59">
+        <w:pict w14:anchorId="4540F915">
           <v:shape id="_x0000_i1043" type="#_x0000_t75" style="width:495pt;height:361.5pt">
             <v:imagedata r:id="rId22" o:title=""/>
           </v:shape>
@@ -4885,7 +4961,7 @@
           <w:sz w:val="22"/>
           <w:szCs w:val="22"/>
         </w:rPr>
-        <w:pict w14:anchorId="08292F8C">
+        <w:pict w14:anchorId="68A0712B">
           <v:shape id="_x0000_i1044" type="#_x0000_t75" style="width:495pt;height:344.25pt">
             <v:imagedata r:id="rId23" o:title=""/>
           </v:shape>
@@ -5047,7 +5123,7 @@
           <w:sz w:val="22"/>
           <w:szCs w:val="22"/>
         </w:rPr>
-        <w:pict w14:anchorId="2F11BFD7">
+        <w:pict w14:anchorId="6E2276F4">
           <v:shape id="_x0000_i1045" type="#_x0000_t75" style="width:495pt;height:344.25pt">
             <v:imagedata r:id="rId24" o:title=""/>
           </v:shape>
@@ -5136,16 +5212,7 @@
           <w:sz w:val="22"/>
           <w:szCs w:val="22"/>
         </w:rPr>
-        <w:t>Input or attack setup: &lt;svg onload="document.getElementById(`se</w:t>
-      </w:r>
-      <w:r>
-        <w:rPr>
-          <w:rFonts w:ascii="Calibri" w:hAnsi="Calibri" w:cs="Calibri"/>
-          <w:kern w:val="0"/>
-          <w:sz w:val="22"/>
-          <w:szCs w:val="22"/>
-        </w:rPr>
-        <w:t>arch-summary`).textContent=`REFLECTED XSS EXECUTED`"&gt;&lt;/svg&gt;</w:t>
+        <w:t>Input or attack setup: &lt;svg onload="document.getElementById(`search-summary`).textContent=`REFLECTED XSS EXECUTED`"&gt;&lt;/svg&gt;</w:t>
       </w:r>
     </w:p>
     <w:p>
@@ -5242,7 +5309,7 @@
           <w:sz w:val="22"/>
           <w:szCs w:val="22"/>
         </w:rPr>
-        <w:pict w14:anchorId="56F95480">
+        <w:pict w14:anchorId="3B3A63E7">
           <v:shape id="_x0000_i1046" type="#_x0000_t75" style="width:495pt;height:344.25pt">
             <v:imagedata r:id="rId25" o:title=""/>
           </v:shape>
@@ -5428,7 +5495,7 @@
           <w:sz w:val="22"/>
           <w:szCs w:val="22"/>
         </w:rPr>
-        <w:pict w14:anchorId="362B9196">
+        <w:pict w14:anchorId="4A177919">
           <v:shape id="_x0000_i1047" type="#_x0000_t75" style="width:495pt;height:344.25pt">
             <v:imagedata r:id="rId26" o:title=""/>
           </v:shape>
@@ -5614,7 +5681,7 @@
           <w:sz w:val="22"/>
           <w:szCs w:val="22"/>
         </w:rPr>
-        <w:pict w14:anchorId="407CEE3A">
+        <w:pict w14:anchorId="018D884E">
           <v:shape id="_x0000_i1048" type="#_x0000_t75" style="width:495pt;height:390pt">
             <v:imagedata r:id="rId27" o:title=""/>
           </v:shape>
@@ -5800,7 +5867,7 @@
           <w:sz w:val="22"/>
           <w:szCs w:val="22"/>
         </w:rPr>
-        <w:pict w14:anchorId="13CBEC88">
+        <w:pict w14:anchorId="2DB2D21B">
           <v:shape id="_x0000_i1049" type="#_x0000_t75" style="width:495pt;height:344.25pt">
             <v:imagedata r:id="rId28" o:title=""/>
           </v:shape>
@@ -5986,7 +6053,7 @@
           <w:sz w:val="22"/>
           <w:szCs w:val="22"/>
         </w:rPr>
-        <w:pict w14:anchorId="113DDF7F">
+        <w:pict w14:anchorId="4033315F">
           <v:shape id="_x0000_i1050" type="#_x0000_t75" style="width:495pt;height:344.25pt">
             <v:imagedata r:id="rId29" o:title=""/>
           </v:shape>
@@ -6172,7 +6239,7 @@
           <w:sz w:val="22"/>
           <w:szCs w:val="22"/>
         </w:rPr>
-        <w:pict w14:anchorId="0DB3C68F">
+        <w:pict w14:anchorId="06F9ED82">
           <v:shape id="_x0000_i1051" type="#_x0000_t75" style="width:495pt;height:344.25pt">
             <v:imagedata r:id="rId30" o:title=""/>
           </v:shape>
@@ -6358,7 +6425,7 @@
           <w:sz w:val="22"/>
           <w:szCs w:val="22"/>
         </w:rPr>
-        <w:pict w14:anchorId="44D51100">
+        <w:pict w14:anchorId="3D1943E2">
           <v:shape id="_x0000_i1052" type="#_x0000_t75" style="width:495pt;height:344.25pt">
             <v:imagedata r:id="rId31" o:title=""/>
           </v:shape>
@@ -6544,7 +6611,7 @@
           <w:sz w:val="22"/>
           <w:szCs w:val="22"/>
         </w:rPr>
-        <w:pict w14:anchorId="3CF9F78E">
+        <w:pict w14:anchorId="0D4DFCA9">
           <v:shape id="_x0000_i1053" type="#_x0000_t75" style="width:495pt;height:344.25pt">
             <v:imagedata r:id="rId32" o:title=""/>
           </v:shape>
@@ -6730,7 +6797,7 @@
           <w:sz w:val="22"/>
           <w:szCs w:val="22"/>
         </w:rPr>
-        <w:pict w14:anchorId="5C9AD229">
+        <w:pict w14:anchorId="03E2A4C8">
           <v:shape id="_x0000_i1054" type="#_x0000_t75" style="width:495pt;height:344.25pt">
             <v:imagedata r:id="rId33" o:title=""/>
           </v:shape>
@@ -6891,16 +6958,7 @@
           <w:sz w:val="22"/>
           <w:szCs w:val="22"/>
         </w:rPr>
-        <w:t>Target URL: http://localh</w:t>
-      </w:r>
-      <w:r>
-        <w:rPr>
-          <w:rFonts w:ascii="Calibri" w:hAnsi="Calibri" w:cs="Calibri"/>
-          <w:kern w:val="0"/>
-          <w:sz w:val="22"/>
-          <w:szCs w:val="22"/>
-        </w:rPr>
-        <w:t>ost:8000/safe/enrollment?reference=ENR-2026-001%27+AND+1%3D1+--+</w:t>
+        <w:t>Target URL: http://localhost:8000/safe/enrollment?reference=ENR-2026-001%27+AND+1%3D1+--+</w:t>
       </w:r>
     </w:p>
     <w:p>
@@ -6925,7 +6983,7 @@
           <w:sz w:val="22"/>
           <w:szCs w:val="22"/>
         </w:rPr>
-        <w:pict w14:anchorId="3A7D44FD">
+        <w:pict w14:anchorId="28D847C7">
           <v:shape id="_x0000_i1055" type="#_x0000_t75" style="width:495pt;height:344.25pt">
             <v:imagedata r:id="rId34" o:title=""/>
           </v:shape>
@@ -7111,7 +7169,7 @@
           <w:sz w:val="22"/>
           <w:szCs w:val="22"/>
         </w:rPr>
-        <w:pict w14:anchorId="72CC6C6F">
+        <w:pict w14:anchorId="0C465CD6">
           <v:shape id="_x0000_i1056" type="#_x0000_t75" style="width:495pt;height:344.25pt">
             <v:imagedata r:id="rId34" o:title=""/>
           </v:shape>
@@ -7297,7 +7355,7 @@
           <w:sz w:val="22"/>
           <w:szCs w:val="22"/>
         </w:rPr>
-        <w:pict w14:anchorId="2768C5F4">
+        <w:pict w14:anchorId="0264326C">
           <v:shape id="_x0000_i1057" type="#_x0000_t75" style="width:495pt;height:344.25pt">
             <v:imagedata r:id="rId35" o:title=""/>
           </v:shape>
@@ -7386,7 +7444,16 @@
           <w:sz w:val="22"/>
           <w:szCs w:val="22"/>
         </w:rPr>
-        <w:t xml:space="preserve">Input or attack setup: ENR-2026-001' AND substr((SELECT password FROM users WHERE username='admin'),1,1)='Z' -- </w:t>
+        <w:t xml:space="preserve">Input or attack setup: ENR-2026-001' AND </w:t>
+      </w:r>
+      <w:r>
+        <w:rPr>
+          <w:rFonts w:ascii="Calibri" w:hAnsi="Calibri" w:cs="Calibri"/>
+          <w:kern w:val="0"/>
+          <w:sz w:val="22"/>
+          <w:szCs w:val="22"/>
+        </w:rPr>
+        <w:t xml:space="preserve">substr((SELECT password FROM users WHERE username='admin'),1,1)='Z' -- </w:t>
       </w:r>
     </w:p>
     <w:p>
@@ -7483,7 +7550,7 @@
           <w:sz w:val="22"/>
           <w:szCs w:val="22"/>
         </w:rPr>
-        <w:pict w14:anchorId="797EDD35">
+        <w:pict w14:anchorId="58EF00F2">
           <v:shape id="_x0000_i1058" type="#_x0000_t75" style="width:495pt;height:344.25pt">
             <v:imagedata r:id="rId36" o:title=""/>
           </v:shape>
@@ -7669,7 +7736,7 @@
           <w:sz w:val="22"/>
           <w:szCs w:val="22"/>
         </w:rPr>
-        <w:pict w14:anchorId="12F9239B">
+        <w:pict w14:anchorId="64042818">
           <v:shape id="_x0000_i1059" type="#_x0000_t75" style="width:495pt;height:344.25pt">
             <v:imagedata r:id="rId37" o:title=""/>
           </v:shape>
@@ -7855,7 +7922,7 @@
           <w:sz w:val="22"/>
           <w:szCs w:val="22"/>
         </w:rPr>
-        <w:pict w14:anchorId="7AD7B3C4">
+        <w:pict w14:anchorId="0E830BF2">
           <v:shape id="_x0000_i1060" type="#_x0000_t75" style="width:495pt;height:344.25pt">
             <v:imagedata r:id="rId38" o:title=""/>
           </v:shape>
@@ -8041,7 +8108,7 @@
           <w:sz w:val="22"/>
           <w:szCs w:val="22"/>
         </w:rPr>
-        <w:pict w14:anchorId="40186AD4">
+        <w:pict w14:anchorId="546DF39E">
           <v:shape id="_x0000_i1061" type="#_x0000_t75" style="width:495pt;height:344.25pt">
             <v:imagedata r:id="rId39" o:title=""/>
           </v:shape>
@@ -8227,7 +8294,7 @@
           <w:sz w:val="22"/>
           <w:szCs w:val="22"/>
         </w:rPr>
-        <w:pict w14:anchorId="03C70DFA">
+        <w:pict w14:anchorId="1927D0CA">
           <v:shape id="_x0000_i1062" type="#_x0000_t75" style="width:495pt;height:344.25pt">
             <v:imagedata r:id="rId40" o:title=""/>
           </v:shape>
@@ -8316,16 +8383,7 @@
           <w:sz w:val="22"/>
           <w:szCs w:val="22"/>
         </w:rPr>
-        <w:t>Input or attack setup: ' UNI</w:t>
-      </w:r>
-      <w:r>
-        <w:rPr>
-          <w:rFonts w:ascii="Calibri" w:hAnsi="Calibri" w:cs="Calibri"/>
-          <w:kern w:val="0"/>
-          <w:sz w:val="22"/>
-          <w:szCs w:val="22"/>
-        </w:rPr>
-        <w:t xml:space="preserve">ON SELECT 'COLUMN',name,type FROM pragma_table_info('users') -- </w:t>
+        <w:t xml:space="preserve">Input or attack setup: ' UNION SELECT 'COLUMN',name,type FROM pragma_table_info('users') -- </w:t>
       </w:r>
     </w:p>
     <w:p>
@@ -8422,7 +8480,7 @@
           <w:sz w:val="22"/>
           <w:szCs w:val="22"/>
         </w:rPr>
-        <w:pict w14:anchorId="066FE3D3">
+        <w:pict w14:anchorId="27818770">
           <v:shape id="_x0000_i1063" type="#_x0000_t75" style="width:495pt;height:344.25pt">
             <v:imagedata r:id="rId41" o:title=""/>
           </v:shape>
@@ -8608,7 +8666,7 @@
           <w:sz w:val="22"/>
           <w:szCs w:val="22"/>
         </w:rPr>
-        <w:pict w14:anchorId="0D83CB61">
+        <w:pict w14:anchorId="2F35940D">
           <v:shape id="_x0000_i1064" type="#_x0000_t75" style="width:495pt;height:344.25pt">
             <v:imagedata r:id="rId42" o:title=""/>
           </v:shape>
@@ -8794,7 +8852,7 @@
           <w:sz w:val="22"/>
           <w:szCs w:val="22"/>
         </w:rPr>
-        <w:pict w14:anchorId="141E04C9">
+        <w:pict w14:anchorId="357D91B0">
           <v:shape id="_x0000_i1065" type="#_x0000_t75" style="width:495pt;height:344.25pt">
             <v:imagedata r:id="rId43" o:title=""/>
           </v:shape>
@@ -9271,7 +9329,7 @@
     <w:link w:val="TitleChar"/>
     <w:uiPriority w:val="10"/>
     <w:qFormat/>
-    <w:rsid w:val="00DA4882"/>
+    <w:rsid w:val="009C2277"/>
     <w:pPr>
       <w:spacing w:before="240" w:after="60"/>
       <w:jc w:val="center"/>
@@ -9291,7 +9349,7 @@
     <w:basedOn w:val="DefaultParagraphFont"/>
     <w:link w:val="Title"/>
     <w:uiPriority w:val="10"/>
-    <w:rsid w:val="00DA4882"/>
+    <w:rsid w:val="009C2277"/>
     <w:rPr>
       <w:rFonts w:asciiTheme="majorHAnsi" w:eastAsiaTheme="majorEastAsia" w:hAnsiTheme="majorHAnsi" w:cstheme="majorBidi"/>
       <w:b/>

</xml_diff>